<commit_message>
Auto-generate TEX, PDF, DOCX, TXT from Markdown
</commit_message>
<xml_diff>
--- a/CV_Gaurav_Nyaupane.docx
+++ b/CV_Gaurav_Nyaupane.docx
@@ -572,6 +572,18 @@
         <w:pStyle w:val="Compact"/>
       </w:pPr>
       <w:r>
+        <w:t xml:space="preserve">Worked with the team lead and stakeholders to architect CareTaskr2.</w:t>
+      </w:r>
+    </w:p>
+    <w:p>
+      <w:pPr>
+        <w:numPr>
+          <w:ilvl w:val="0"/>
+          <w:numId w:val="1003"/>
+        </w:numPr>
+        <w:pStyle w:val="Compact"/>
+      </w:pPr>
+      <w:r>
         <w:t xml:space="preserve">Led the architectural transition from Angular to React using a micro-frontend strategy, enabling incremental modernization without system downtime.</w:t>
       </w:r>
     </w:p>
@@ -596,6 +608,18 @@
         <w:pStyle w:val="Compact"/>
       </w:pPr>
       <w:r>
+        <w:t xml:space="preserve">Developed and deployed 100+ new features for Caretaskr2.</w:t>
+      </w:r>
+    </w:p>
+    <w:p>
+      <w:pPr>
+        <w:numPr>
+          <w:ilvl w:val="0"/>
+          <w:numId w:val="1003"/>
+        </w:numPr>
+        <w:pStyle w:val="Compact"/>
+      </w:pPr>
+      <w:r>
         <w:t xml:space="preserve">Initiated and architected the PlanCare Portal mobile application using React Native.</w:t>
       </w:r>
     </w:p>
@@ -608,7 +632,7 @@
         <w:pStyle w:val="Compact"/>
       </w:pPr>
       <w:r>
-        <w:t xml:space="preserve">Improved platform performance by approximately 35 percent through backend and frontend optimizations.</w:t>
+        <w:t xml:space="preserve">Improved Caretaskr’s platform performance by approximately 35 percent through backend and frontend optimizations.</w:t>
       </w:r>
     </w:p>
     <w:p>
@@ -620,7 +644,7 @@
         <w:pStyle w:val="Compact"/>
       </w:pPr>
       <w:r>
-        <w:t xml:space="preserve">Designed and implemented over 250 unit tests, substantially increasing code reliability and maintainability.</w:t>
+        <w:t xml:space="preserve">Designed and implemented over 1000 unit tests, substantially increasing code reliability and maintainability.</w:t>
       </w:r>
     </w:p>
     <w:p>

</xml_diff>